<commit_message>
muchas mejoras al front
</commit_message>
<xml_diff>
--- a/billing/templates/billing/contrato_editado.docx
+++ b/billing/templates/billing/contrato_editado.docx
@@ -68,7 +68,7 @@
           <w:szCs w:val="20"/>
           <w:lang w:val="es-MX" w:eastAsia="es-MX"/>
         </w:rPr>
-        <w:t xml:space="preserve">2022-08-18 21:59:01.889000+00:00</w:t>
+        <w:t xml:space="preserve">2022-09-22 02:38:31.342000+00:00</w:t>
       </w:r>
     </w:p>
     <w:p>
@@ -97,7 +97,7 @@
           <w:szCs w:val="20"/>
           <w:lang w:val="es-MX" w:eastAsia="es-MX"/>
         </w:rPr>
-        <w:t xml:space="preserve">148</w:t>
+        <w:t xml:space="preserve">166</w:t>
       </w:r>
     </w:p>
     <w:p>

</xml_diff>

<commit_message>
permite exporta a administradores
</commit_message>
<xml_diff>
--- a/billing/templates/billing/contrato_editado.docx
+++ b/billing/templates/billing/contrato_editado.docx
@@ -68,7 +68,7 @@
           <w:szCs w:val="20"/>
           <w:lang w:val="es-MX" w:eastAsia="es-MX"/>
         </w:rPr>
-        <w:t xml:space="preserve">2022-09-22 02:38:31.342000+00:00</w:t>
+        <w:t xml:space="preserve">None</w:t>
       </w:r>
     </w:p>
     <w:p>
@@ -97,7 +97,7 @@
           <w:szCs w:val="20"/>
           <w:lang w:val="es-MX" w:eastAsia="es-MX"/>
         </w:rPr>
-        <w:t xml:space="preserve">166</w:t>
+        <w:t xml:space="preserve">5</w:t>
       </w:r>
     </w:p>
     <w:p>
@@ -328,7 +328,7 @@
           <w:szCs w:val="20"/>
           <w:lang w:val="es-MX" w:eastAsia="es-MX"/>
         </w:rPr>
-        <w:t xml:space="preserve">Luis Alejandro Cruz Ordóñez</w:t>
+        <w:t xml:space="preserve">Luis Alejandro Cruz ordoñez</w:t>
       </w:r>
     </w:p>
     <w:p>
@@ -469,7 +469,7 @@
           <w:szCs w:val="20"/>
           <w:lang w:val="es-MX" w:eastAsia="es-MX"/>
         </w:rPr>
-        <w:t xml:space="preserve">Jose Rodrigo Cruz</w:t>
+        <w:t xml:space="preserve">Rodrigo José Cruz</w:t>
       </w:r>
     </w:p>
     <w:p>
@@ -493,7 +493,7 @@
           <w:szCs w:val="20"/>
           <w:lang w:val="es-MX" w:eastAsia="es-MX"/>
         </w:rPr>
-        <w:t xml:space="preserve">10528032</w:t>
+        <w:t xml:space="preserve">11440325400</w:t>
       </w:r>
     </w:p>
     <w:p>
@@ -519,7 +519,7 @@
           <w:szCs w:val="20"/>
           <w:lang w:val="es-MX" w:eastAsia="es-MX"/>
         </w:rPr>
-        <w:t xml:space="preserve">rodri@hotmail.com</w:t>
+        <w:t xml:space="preserve">jose-rodrigo51@hotmail.com</w:t>
       </w:r>
     </w:p>
     <w:p>
@@ -543,7 +543,7 @@
           <w:szCs w:val="20"/>
           <w:lang w:val="es-MX" w:eastAsia="es-MX"/>
         </w:rPr>
-        <w:t xml:space="preserve">+573136817011</w:t>
+        <w:t xml:space="preserve">+573116494967</w:t>
       </w:r>
     </w:p>
     <w:p>
@@ -8664,7 +8664,7 @@
                 <w:szCs w:val="20"/>
                 <w:lang w:val="es-MX" w:eastAsia="es-MX"/>
               </w:rPr>
-              <w:t xml:space="preserve">Luis Alejandro Cruz Ordóñez</w:t>
+              <w:t xml:space="preserve">Luis Alejandro Cruz ordoñez</w:t>
             </w:r>
           </w:p>
           <w:p>

</xml_diff>